<commit_message>
Replace rule shorthand with plain descriptions in the Phase 2 report
The report referred to rules as T1 to T10 and to policies as P1 to P5.
Those labels are defined only in database/README.md, so a reader of the
report alone could not tell what any of them meant.

Each rule now carries a descriptive name and its full statement in the
section 6.1 table, the policies are numbered headings that state the policy
in the heading itself, and every later cross-reference names the rule
instead of a code. The grouping that Phase 1 called the three constraint
tiers is now described in words.

The quoted source comments in Appendix B were reworded in the source files
too, so the listings remain exact quotations. Those edits are comments and
docstrings only, with no change in behaviour; the 67 tests still pass.

The Phase 1 report, database/README.md where the original numbering lives,
the SQL scripts and the database are unchanged.
</commit_message>
<xml_diff>
--- a/docs/phase-2/final/Smart_Campus_Placement_Phase_2_Report.docx
+++ b/docs/phase-2/final/Smart_Campus_Placement_Phase_2_Report.docx
@@ -561,7 +561,7 @@
           <w:color w:val="555555"/>
           <w:sz w:val="19"/>
         </w:rPr>
-        <w:t>6.1 The Tier 2 rules from Phase 1</w:t>
+        <w:t>6.1 The cross-table rules carried over from Phase 1</w:t>
       </w:r>
     </w:p>
     <w:p>
@@ -709,7 +709,7 @@
           <w:color w:val="555555"/>
           <w:sz w:val="19"/>
         </w:rPr>
-        <w:t>7.4 Avoiding the N+1 pattern</w:t>
+        <w:t>7.4 Avoiding repeated queries</w:t>
       </w:r>
     </w:p>
     <w:p>
@@ -993,7 +993,7 @@
           <w:color w:val="555555"/>
           <w:sz w:val="19"/>
         </w:rPr>
-        <w:t>B.2 Rule T1, from backend/app/rules.py</w:t>
+        <w:t>B.2 The placement rule, from backend/app/rules.py</w:t>
       </w:r>
     </w:p>
     <w:p>
@@ -1085,7 +1085,7 @@
         <w:jc w:val="both"/>
       </w:pPr>
       <w:r>
-        <w:t>That phase deliberately stopped at the schema. A MySQL CHECK constraint may read only the columns of the row currently being written. It cannot consult another table, another row, or a subquery. Several rules that the placement cell genuinely needs therefore could not be expressed in DDL at all. Phase 1 recorded them rather than faking them, in a three tier constraint strategy:</w:t>
+        <w:t>That phase deliberately stopped at the schema. A MySQL CHECK constraint may read only the columns of the row currently being written. It cannot consult another table, another row, or a subquery. Several rules that the placement cell genuinely needs therefore could not be expressed in DDL at all. Phase 1 recorded them rather than faking them, sorting every constraint into three groups:</w:t>
       </w:r>
     </w:p>
     <w:p>
@@ -1094,7 +1094,7 @@
         <w:spacing w:after="60"/>
       </w:pPr>
       <w:r>
-        <w:t>Tier 1 - rules the DDL enforces: primary keys, foreign keys, UNIQUE, NOT NULL, DEFAULT, ENUM domains and same row CHECK constraints.</w:t>
+        <w:t>Constraints the DDL enforces by itself: primary keys, foreign keys, UNIQUE, NOT NULL, DEFAULT, ENUM domains, and CHECK constraints that read only the row being written.</w:t>
       </w:r>
     </w:p>
     <w:p>
@@ -1103,7 +1103,7 @@
         <w:spacing w:after="60"/>
       </w:pPr>
       <w:r>
-        <w:t>Tier 2 - rules T1 to T10, each of which reads another table or another row, and so requires a trigger or application logic.</w:t>
+        <w:t>Cross-table rules: ten rules, each of which must read another table or another row, and so requires either a trigger or application logic. They are listed in full in section 6.1.</w:t>
       </w:r>
     </w:p>
     <w:p>
@@ -1112,7 +1112,7 @@
         <w:spacing w:after="60"/>
       </w:pPr>
       <w:r>
-        <w:t>Tier 3 - application and business logic: eligibility screening, skill matching, round progression and placement statistics.</w:t>
+        <w:t>Application and business logic: eligibility screening, skill matching, round progression and placement statistics.</w:t>
       </w:r>
     </w:p>
     <w:p>
@@ -1186,7 +1186,7 @@
         <w:spacing w:after="60"/>
       </w:pPr>
       <w:r>
-        <w:t>Implement the Tier 2 and Tier 3 rules in the application layer.</w:t>
+        <w:t>Implement the cross-table rules and the business logic in the application layer.</w:t>
       </w:r>
     </w:p>
     <w:p>
@@ -1932,7 +1932,7 @@
               <w:rPr>
                 <w:sz w:val="17"/>
               </w:rPr>
-              <w:t>The Tier 2 and Tier 3 rules and the documented project policies.</w:t>
+              <w:t>The cross-table rules of section 6.1 and the project policies of section 6.3.</w:t>
             </w:r>
           </w:p>
         </w:tc>
@@ -3212,7 +3212,7 @@
         <w:jc w:val="both"/>
       </w:pPr>
       <w:r>
-        <w:t>The clearest beneficiary is offer issue. Creating an offer also advances the application to the Selected status, which is rule T6. Both writes share the one transaction, so the offer and the application status can never disagree.</w:t>
+        <w:t>The clearest beneficiary is offer issue. Creating an offer also advances the application to the Selected status. Both writes share the one transaction, so the offer and the application status can never disagree.</w:t>
       </w:r>
     </w:p>
     <w:p>
@@ -4381,7 +4381,7 @@
         <w:spacing w:after="60"/>
       </w:pPr>
       <w:r>
-        <w:t>One drive has no eligibility_criteria row at all, which exercises the optional one-to-one relationship and policy P1 in section 6.3.</w:t>
+        <w:t>One drive has no eligibility_criteria row at all, which exercises the optional one-to-one relationship and the missing criteria policy in section 6.3.</w:t>
       </w:r>
     </w:p>
     <w:p>
@@ -4390,7 +4390,7 @@
         <w:spacing w:after="60"/>
       </w:pPr>
       <w:r>
-        <w:t>One drive has no drive_eligible_department rows, which exercises policy P2.</w:t>
+        <w:t>One drive has no drive_eligible_department rows, which exercises the missing department policy in section 6.3.</w:t>
       </w:r>
     </w:p>
     <w:p>
@@ -5386,7 +5386,7 @@
           <w:i w:val="0"/>
           <w:sz w:val="24"/>
         </w:rPr>
-        <w:t>6.1 The Tier 2 rules from Phase 1</w:t>
+        <w:t>6.1 The cross-table rules carried over from Phase 1</w:t>
       </w:r>
     </w:p>
     <w:p>
@@ -5394,7 +5394,7 @@
         <w:jc w:val="both"/>
       </w:pPr>
       <w:r>
-        <w:t>Phase 1 documented ten rules that no CHECK constraint can express, because each one reads another table or another row. Phase 2 implements nine of them in the service layer. Because they sit in the service layer rather than in the interface, they apply to every caller, including a client that addresses the API directly.</w:t>
+        <w:t>Phase 1 documented ten rules that no CHECK constraint can express, because each one has to read another table or another row. Phase 2 implements nine of the ten in the service layer. Because they sit in the service layer rather than in the interface, they apply to every caller, including a client that addresses the API directly. Each rule is named and stated in full below, and the report uses those descriptions throughout rather than any abbreviation.</w:t>
       </w:r>
     </w:p>
     <w:tbl>
@@ -5413,7 +5413,7 @@
       <w:tr>
         <w:tc>
           <w:tcPr>
-            <w:tcW w:type="dxa" w:w="783"/>
+            <w:tcW w:type="dxa" w:w="2350"/>
             <w:shd w:val="clear" w:fill="EEF1F6"/>
           </w:tcPr>
           <w:p>
@@ -5429,7 +5429,7 @@
         </w:tc>
         <w:tc>
           <w:tcPr>
-            <w:tcW w:type="dxa" w:w="6169"/>
+            <w:tcW w:type="dxa" w:w="5092"/>
             <w:shd w:val="clear" w:fill="EEF1F6"/>
           </w:tcPr>
           <w:p>
@@ -5439,13 +5439,13 @@
                 <w:b/>
                 <w:sz w:val="17"/>
               </w:rPr>
-              <w:t>Statement</w:t>
-            </w:r>
-          </w:p>
-        </w:tc>
-        <w:tc>
-          <w:tcPr>
-            <w:tcW w:type="dxa" w:w="2840"/>
+              <w:t>What it requires</w:t>
+            </w:r>
+          </w:p>
+        </w:tc>
+        <w:tc>
+          <w:tcPr>
+            <w:tcW w:type="dxa" w:w="2350"/>
             <w:shd w:val="clear" w:fill="EEF1F6"/>
           </w:tcPr>
           <w:p>
@@ -5463,35 +5463,35 @@
       <w:tr>
         <w:tc>
           <w:tcPr>
-            <w:tcW w:type="dxa" w:w="783"/>
-          </w:tcPr>
-          <w:p>
-            <w:r/>
-            <w:r>
-              <w:rPr>
-                <w:sz w:val="17"/>
-              </w:rPr>
-              <w:t>T1</w:t>
-            </w:r>
-          </w:p>
-        </w:tc>
-        <w:tc>
-          <w:tcPr>
-            <w:tcW w:type="dxa" w:w="6169"/>
-          </w:tcPr>
-          <w:p>
-            <w:r/>
-            <w:r>
-              <w:rPr>
-                <w:sz w:val="17"/>
-              </w:rPr>
-              <w:t>A placement record may exist only against an Accepted offer</w:t>
-            </w:r>
-          </w:p>
-        </w:tc>
-        <w:tc>
-          <w:tcPr>
-            <w:tcW w:type="dxa" w:w="2840"/>
+            <w:tcW w:type="dxa" w:w="2350"/>
+          </w:tcPr>
+          <w:p>
+            <w:r/>
+            <w:r>
+              <w:rPr>
+                <w:sz w:val="17"/>
+              </w:rPr>
+              <w:t>Placement needs an accepted offer</w:t>
+            </w:r>
+          </w:p>
+        </w:tc>
+        <w:tc>
+          <w:tcPr>
+            <w:tcW w:type="dxa" w:w="5092"/>
+          </w:tcPr>
+          <w:p>
+            <w:r/>
+            <w:r>
+              <w:rPr>
+                <w:sz w:val="17"/>
+              </w:rPr>
+              <w:t>A placement record may exist only against an offer whose status is Accepted</w:t>
+            </w:r>
+          </w:p>
+        </w:tc>
+        <w:tc>
+          <w:tcPr>
+            <w:tcW w:type="dxa" w:w="2350"/>
           </w:tcPr>
           <w:p>
             <w:r/>
@@ -5507,35 +5507,35 @@
       <w:tr>
         <w:tc>
           <w:tcPr>
-            <w:tcW w:type="dxa" w:w="783"/>
-          </w:tcPr>
-          <w:p>
-            <w:r/>
-            <w:r>
-              <w:rPr>
-                <w:sz w:val="17"/>
-              </w:rPr>
-              <w:t>T2</w:t>
-            </w:r>
-          </w:p>
-        </w:tc>
-        <w:tc>
-          <w:tcPr>
-            <w:tcW w:type="dxa" w:w="6169"/>
-          </w:tcPr>
-          <w:p>
-            <w:r/>
-            <w:r>
-              <w:rPr>
-                <w:sz w:val="17"/>
-              </w:rPr>
-              <w:t>An application cannot be submitted after the drive's deadline</w:t>
-            </w:r>
-          </w:p>
-        </w:tc>
-        <w:tc>
-          <w:tcPr>
-            <w:tcW w:type="dxa" w:w="2840"/>
+            <w:tcW w:type="dxa" w:w="2350"/>
+          </w:tcPr>
+          <w:p>
+            <w:r/>
+            <w:r>
+              <w:rPr>
+                <w:sz w:val="17"/>
+              </w:rPr>
+              <w:t>Application deadline</w:t>
+            </w:r>
+          </w:p>
+        </w:tc>
+        <w:tc>
+          <w:tcPr>
+            <w:tcW w:type="dxa" w:w="5092"/>
+          </w:tcPr>
+          <w:p>
+            <w:r/>
+            <w:r>
+              <w:rPr>
+                <w:sz w:val="17"/>
+              </w:rPr>
+              <w:t>An application cannot be submitted after the drive's application deadline</w:t>
+            </w:r>
+          </w:p>
+        </w:tc>
+        <w:tc>
+          <w:tcPr>
+            <w:tcW w:type="dxa" w:w="2350"/>
           </w:tcPr>
           <w:p>
             <w:r/>
@@ -5551,35 +5551,35 @@
       <w:tr>
         <w:tc>
           <w:tcPr>
-            <w:tcW w:type="dxa" w:w="783"/>
-          </w:tcPr>
-          <w:p>
-            <w:r/>
-            <w:r>
-              <w:rPr>
-                <w:sz w:val="17"/>
-              </w:rPr>
-              <w:t>T3</w:t>
-            </w:r>
-          </w:p>
-        </w:tc>
-        <w:tc>
-          <w:tcPr>
-            <w:tcW w:type="dxa" w:w="6169"/>
-          </w:tcPr>
-          <w:p>
-            <w:r/>
-            <w:r>
-              <w:rPr>
-                <w:sz w:val="17"/>
-              </w:rPr>
-              <w:t>The applicant must satisfy the drive's academic criteria</w:t>
-            </w:r>
-          </w:p>
-        </w:tc>
-        <w:tc>
-          <w:tcPr>
-            <w:tcW w:type="dxa" w:w="2840"/>
+            <w:tcW w:type="dxa" w:w="2350"/>
+          </w:tcPr>
+          <w:p>
+            <w:r/>
+            <w:r>
+              <w:rPr>
+                <w:sz w:val="17"/>
+              </w:rPr>
+              <w:t>Academic criteria</w:t>
+            </w:r>
+          </w:p>
+        </w:tc>
+        <w:tc>
+          <w:tcPr>
+            <w:tcW w:type="dxa" w:w="5092"/>
+          </w:tcPr>
+          <w:p>
+            <w:r/>
+            <w:r>
+              <w:rPr>
+                <w:sz w:val="17"/>
+              </w:rPr>
+              <w:t>The applicant must satisfy the drive's CGPA, backlog, percentage and batch year requirements</w:t>
+            </w:r>
+          </w:p>
+        </w:tc>
+        <w:tc>
+          <w:tcPr>
+            <w:tcW w:type="dxa" w:w="2350"/>
           </w:tcPr>
           <w:p>
             <w:r/>
@@ -5595,35 +5595,35 @@
       <w:tr>
         <w:tc>
           <w:tcPr>
-            <w:tcW w:type="dxa" w:w="783"/>
-          </w:tcPr>
-          <w:p>
-            <w:r/>
-            <w:r>
-              <w:rPr>
-                <w:sz w:val="17"/>
-              </w:rPr>
-              <w:t>T4</w:t>
-            </w:r>
-          </w:p>
-        </w:tc>
-        <w:tc>
-          <w:tcPr>
-            <w:tcW w:type="dxa" w:w="6169"/>
-          </w:tcPr>
-          <w:p>
-            <w:r/>
-            <w:r>
-              <w:rPr>
-                <w:sz w:val="17"/>
-              </w:rPr>
-              <w:t>The applicant's department must appear in the drive's eligible list</w:t>
-            </w:r>
-          </w:p>
-        </w:tc>
-        <w:tc>
-          <w:tcPr>
-            <w:tcW w:type="dxa" w:w="2840"/>
+            <w:tcW w:type="dxa" w:w="2350"/>
+          </w:tcPr>
+          <w:p>
+            <w:r/>
+            <w:r>
+              <w:rPr>
+                <w:sz w:val="17"/>
+              </w:rPr>
+              <w:t>Eligible department</w:t>
+            </w:r>
+          </w:p>
+        </w:tc>
+        <w:tc>
+          <w:tcPr>
+            <w:tcW w:type="dxa" w:w="5092"/>
+          </w:tcPr>
+          <w:p>
+            <w:r/>
+            <w:r>
+              <w:rPr>
+                <w:sz w:val="17"/>
+              </w:rPr>
+              <w:t>The applicant's department must appear in the drive's eligible department list</w:t>
+            </w:r>
+          </w:p>
+        </w:tc>
+        <w:tc>
+          <w:tcPr>
+            <w:tcW w:type="dxa" w:w="2350"/>
           </w:tcPr>
           <w:p>
             <w:r/>
@@ -5639,35 +5639,35 @@
       <w:tr>
         <w:tc>
           <w:tcPr>
-            <w:tcW w:type="dxa" w:w="783"/>
-          </w:tcPr>
-          <w:p>
-            <w:r/>
-            <w:r>
-              <w:rPr>
-                <w:sz w:val="17"/>
-              </w:rPr>
-              <w:t>T5</w:t>
-            </w:r>
-          </w:p>
-        </w:tc>
-        <w:tc>
-          <w:tcPr>
-            <w:tcW w:type="dxa" w:w="6169"/>
-          </w:tcPr>
-          <w:p>
-            <w:r/>
-            <w:r>
-              <w:rPr>
-                <w:sz w:val="17"/>
-              </w:rPr>
-              <w:t>allow_placed_students = FALSE blocks an already placed applicant</w:t>
-            </w:r>
-          </w:p>
-        </w:tc>
-        <w:tc>
-          <w:tcPr>
-            <w:tcW w:type="dxa" w:w="2840"/>
+            <w:tcW w:type="dxa" w:w="2350"/>
+          </w:tcPr>
+          <w:p>
+            <w:r/>
+            <w:r>
+              <w:rPr>
+                <w:sz w:val="17"/>
+              </w:rPr>
+              <w:t>Placed students excluded</w:t>
+            </w:r>
+          </w:p>
+        </w:tc>
+        <w:tc>
+          <w:tcPr>
+            <w:tcW w:type="dxa" w:w="5092"/>
+          </w:tcPr>
+          <w:p>
+            <w:r/>
+            <w:r>
+              <w:rPr>
+                <w:sz w:val="17"/>
+              </w:rPr>
+              <w:t>When allow_placed_students is FALSE, an already placed applicant is blocked</w:t>
+            </w:r>
+          </w:p>
+        </w:tc>
+        <w:tc>
+          <w:tcPr>
+            <w:tcW w:type="dxa" w:w="2350"/>
           </w:tcPr>
           <w:p>
             <w:r/>
@@ -5683,35 +5683,35 @@
       <w:tr>
         <w:tc>
           <w:tcPr>
-            <w:tcW w:type="dxa" w:w="783"/>
-          </w:tcPr>
-          <w:p>
-            <w:r/>
-            <w:r>
-              <w:rPr>
-                <w:sz w:val="17"/>
-              </w:rPr>
-              <w:t>T6</w:t>
-            </w:r>
-          </w:p>
-        </w:tc>
-        <w:tc>
-          <w:tcPr>
-            <w:tcW w:type="dxa" w:w="6169"/>
-          </w:tcPr>
-          <w:p>
-            <w:r/>
-            <w:r>
-              <w:rPr>
-                <w:sz w:val="17"/>
-              </w:rPr>
-              <w:t>Issuing an offer sets the application status to Selected</w:t>
-            </w:r>
-          </w:p>
-        </w:tc>
-        <w:tc>
-          <w:tcPr>
-            <w:tcW w:type="dxa" w:w="2840"/>
+            <w:tcW w:type="dxa" w:w="2350"/>
+          </w:tcPr>
+          <w:p>
+            <w:r/>
+            <w:r>
+              <w:rPr>
+                <w:sz w:val="17"/>
+              </w:rPr>
+              <w:t>Offer selects the application</w:t>
+            </w:r>
+          </w:p>
+        </w:tc>
+        <w:tc>
+          <w:tcPr>
+            <w:tcW w:type="dxa" w:w="5092"/>
+          </w:tcPr>
+          <w:p>
+            <w:r/>
+            <w:r>
+              <w:rPr>
+                <w:sz w:val="17"/>
+              </w:rPr>
+              <w:t>Issuing an offer sets that application's status to Selected</w:t>
+            </w:r>
+          </w:p>
+        </w:tc>
+        <w:tc>
+          <w:tcPr>
+            <w:tcW w:type="dxa" w:w="2350"/>
           </w:tcPr>
           <w:p>
             <w:r/>
@@ -5727,21 +5727,21 @@
       <w:tr>
         <w:tc>
           <w:tcPr>
-            <w:tcW w:type="dxa" w:w="783"/>
-          </w:tcPr>
-          <w:p>
-            <w:r/>
-            <w:r>
-              <w:rPr>
-                <w:sz w:val="17"/>
-              </w:rPr>
-              <w:t>T7</w:t>
-            </w:r>
-          </w:p>
-        </w:tc>
-        <w:tc>
-          <w:tcPr>
-            <w:tcW w:type="dxa" w:w="6169"/>
+            <w:tcW w:type="dxa" w:w="2350"/>
+          </w:tcPr>
+          <w:p>
+            <w:r/>
+            <w:r>
+              <w:rPr>
+                <w:sz w:val="17"/>
+              </w:rPr>
+              <w:t>Interview follows the application</w:t>
+            </w:r>
+          </w:p>
+        </w:tc>
+        <w:tc>
+          <w:tcPr>
+            <w:tcW w:type="dxa" w:w="5092"/>
           </w:tcPr>
           <w:p>
             <w:r/>
@@ -5755,7 +5755,7 @@
         </w:tc>
         <w:tc>
           <w:tcPr>
-            <w:tcW w:type="dxa" w:w="2840"/>
+            <w:tcW w:type="dxa" w:w="2350"/>
           </w:tcPr>
           <w:p>
             <w:r/>
@@ -5771,35 +5771,35 @@
       <w:tr>
         <w:tc>
           <w:tcPr>
-            <w:tcW w:type="dxa" w:w="783"/>
-          </w:tcPr>
-          <w:p>
-            <w:r/>
-            <w:r>
-              <w:rPr>
-                <w:sz w:val="17"/>
-              </w:rPr>
-              <w:t>T8</w:t>
-            </w:r>
-          </w:p>
-        </w:tc>
-        <w:tc>
-          <w:tcPr>
-            <w:tcW w:type="dxa" w:w="6169"/>
-          </w:tcPr>
-          <w:p>
-            <w:r/>
-            <w:r>
-              <w:rPr>
-                <w:sz w:val="17"/>
-              </w:rPr>
-              <w:t>drive_status may not move backwards</w:t>
-            </w:r>
-          </w:p>
-        </w:tc>
-        <w:tc>
-          <w:tcPr>
-            <w:tcW w:type="dxa" w:w="2840"/>
+            <w:tcW w:type="dxa" w:w="2350"/>
+          </w:tcPr>
+          <w:p>
+            <w:r/>
+            <w:r>
+              <w:rPr>
+                <w:sz w:val="17"/>
+              </w:rPr>
+              <w:t>Drive status moves forward only</w:t>
+            </w:r>
+          </w:p>
+        </w:tc>
+        <w:tc>
+          <w:tcPr>
+            <w:tcW w:type="dxa" w:w="5092"/>
+          </w:tcPr>
+          <w:p>
+            <w:r/>
+            <w:r>
+              <w:rPr>
+                <w:sz w:val="17"/>
+              </w:rPr>
+              <w:t>drive_status may not move backwards, for example from Completed to Open</w:t>
+            </w:r>
+          </w:p>
+        </w:tc>
+        <w:tc>
+          <w:tcPr>
+            <w:tcW w:type="dxa" w:w="2350"/>
           </w:tcPr>
           <w:p>
             <w:r/>
@@ -5815,35 +5815,35 @@
       <w:tr>
         <w:tc>
           <w:tcPr>
-            <w:tcW w:type="dxa" w:w="783"/>
-          </w:tcPr>
-          <w:p>
-            <w:r/>
-            <w:r>
-              <w:rPr>
-                <w:sz w:val="17"/>
-              </w:rPr>
-              <w:t>T9</w:t>
-            </w:r>
-          </w:p>
-        </w:tc>
-        <w:tc>
-          <w:tcPr>
-            <w:tcW w:type="dxa" w:w="6169"/>
-          </w:tcPr>
-          <w:p>
-            <w:r/>
-            <w:r>
-              <w:rPr>
-                <w:sz w:val="17"/>
-              </w:rPr>
-              <w:t>company_employee_code unique within one company</w:t>
-            </w:r>
-          </w:p>
-        </w:tc>
-        <w:tc>
-          <w:tcPr>
-            <w:tcW w:type="dxa" w:w="2840"/>
+            <w:tcW w:type="dxa" w:w="2350"/>
+          </w:tcPr>
+          <w:p>
+            <w:r/>
+            <w:r>
+              <w:rPr>
+                <w:sz w:val="17"/>
+              </w:rPr>
+              <w:t>Employee code unique per company</w:t>
+            </w:r>
+          </w:p>
+        </w:tc>
+        <w:tc>
+          <w:tcPr>
+            <w:tcW w:type="dxa" w:w="5092"/>
+          </w:tcPr>
+          <w:p>
+            <w:r/>
+            <w:r>
+              <w:rPr>
+                <w:sz w:val="17"/>
+              </w:rPr>
+              <w:t>company_employee_code must be unique within one company</w:t>
+            </w:r>
+          </w:p>
+        </w:tc>
+        <w:tc>
+          <w:tcPr>
+            <w:tcW w:type="dxa" w:w="2350"/>
           </w:tcPr>
           <w:p>
             <w:r/>
@@ -5859,35 +5859,35 @@
       <w:tr>
         <w:tc>
           <w:tcPr>
-            <w:tcW w:type="dxa" w:w="783"/>
-          </w:tcPr>
-          <w:p>
-            <w:r/>
-            <w:r>
-              <w:rPr>
-                <w:sz w:val="17"/>
-              </w:rPr>
-              <w:t>T10</w:t>
-            </w:r>
-          </w:p>
-        </w:tc>
-        <w:tc>
-          <w:tcPr>
-            <w:tcW w:type="dxa" w:w="6169"/>
-          </w:tcPr>
-          <w:p>
-            <w:r/>
-            <w:r>
-              <w:rPr>
-                <w:sz w:val="17"/>
-              </w:rPr>
-              <w:t>At most one offer per application</w:t>
-            </w:r>
-          </w:p>
-        </w:tc>
-        <w:tc>
-          <w:tcPr>
-            <w:tcW w:type="dxa" w:w="2840"/>
+            <w:tcW w:type="dxa" w:w="2350"/>
+          </w:tcPr>
+          <w:p>
+            <w:r/>
+            <w:r>
+              <w:rPr>
+                <w:sz w:val="17"/>
+              </w:rPr>
+              <w:t>One offer per application</w:t>
+            </w:r>
+          </w:p>
+        </w:tc>
+        <w:tc>
+          <w:tcPr>
+            <w:tcW w:type="dxa" w:w="5092"/>
+          </w:tcPr>
+          <w:p>
+            <w:r/>
+            <w:r>
+              <w:rPr>
+                <w:sz w:val="17"/>
+              </w:rPr>
+              <w:t>An application may have at most one offer</w:t>
+            </w:r>
+          </w:p>
+        </w:tc>
+        <w:tc>
+          <w:tcPr>
+            <w:tcW w:type="dxa" w:w="2350"/>
           </w:tcPr>
           <w:p>
             <w:r/>
@@ -5928,7 +5928,7 @@
                 <w:b/>
                 <w:sz w:val="20"/>
               </w:rPr>
-              <w:t>Rule T9 is not implemented. The uniqueness of company_employee_code is scoped to a company, which the present schema does not express, and no Phase 2 screen depends on it. It is recorded here and in section 11 as outstanding rather than claimed as complete.</w:t>
+              <w:t>One rule of the ten is outstanding: company_employee_code is not checked for uniqueness within a company. That uniqueness is scoped to a company, which the present schema does not express, and no Phase 2 screen depends on it. It is recorded here and in section 11 as incomplete rather than claimed as done.</w:t>
             </w:r>
           </w:p>
         </w:tc>
@@ -5957,7 +5957,7 @@
         <w:jc w:val="both"/>
       </w:pPr>
       <w:r>
-        <w:t>Beyond the Phase 1 list, the service layer also enforces the following. Each is backed by a database constraint where one exists, so the application check improves the message without being the only defence.</w:t>
+        <w:t>Beyond the ten rules above, the service layer also enforces the following. Each is backed by a database constraint where one exists, so the application check improves the error message without being the only defence. The constraint name is given in brackets.</w:t>
       </w:r>
     </w:p>
     <w:p>
@@ -6072,7 +6072,7 @@
           <w:i/>
           <w:sz w:val="21"/>
         </w:rPr>
-        <w:t>P1 - A drive with no eligibility criteria has no academic gate</w:t>
+        <w:t>Policy 1. A drive with no eligibility criteria has no academic gate</w:t>
       </w:r>
     </w:p>
     <w:p>
@@ -6088,7 +6088,7 @@
         <w:jc w:val="both"/>
       </w:pPr>
       <w:r>
-        <w:t>It is deliberately not treated as though every cut-off were zero. 'No academic requirement has been defined' and 'the academic requirement is zero' are different facts, and a caller must be able to tell them apart. The deadline rule and the department rule still apply to such a drive. The drive detail screen states this condition in plain language rather than leaving the section blank, which is visible in Figure 7.</w:t>
+        <w:t>It is deliberately not treated as though every cut-off were zero. 'No academic requirement has been defined' and 'the academic requirement is zero' are different facts, and a caller must be able to tell them apart. The deadline rule and the department rule still apply to such a drive. The drive detail screen states this condition in plain language rather than leaving the section blank, as Figure 7 shows.</w:t>
       </w:r>
     </w:p>
     <w:p>
@@ -6101,7 +6101,7 @@
           <w:i/>
           <w:sz w:val="21"/>
         </w:rPr>
-        <w:t>P2 - A drive with no eligible departments is open to all departments</w:t>
+        <w:t>Policy 2. A drive with no eligible departments is open to all departments</w:t>
       </w:r>
     </w:p>
     <w:p>
@@ -6122,7 +6122,7 @@
           <w:i/>
           <w:sz w:val="21"/>
         </w:rPr>
-        <w:t>P3 - The meaning of 'already placed'</w:t>
+        <w:t>Policy 3. What counts as being already placed</w:t>
       </w:r>
     </w:p>
     <w:p>
@@ -6143,7 +6143,7 @@
           <w:i/>
           <w:sz w:val="21"/>
         </w:rPr>
-        <w:t>P4 - Applications are accepted only while the drive is Open</w:t>
+        <w:t>Policy 4. Applications are accepted only while the drive is Open</w:t>
       </w:r>
     </w:p>
     <w:p>
@@ -6164,7 +6164,7 @@
           <w:i/>
           <w:sz w:val="21"/>
         </w:rPr>
-        <w:t>P5 - Drive status moves forward only</w:t>
+        <w:t>Policy 5. Drive status moves forward only</w:t>
       </w:r>
     </w:p>
     <w:p>
@@ -6231,7 +6231,7 @@
         <w:jc w:val="both"/>
       </w:pPr>
       <w:r>
-        <w:t>For a whole cohort against one drive, a separate endpoint pushes the criteria into the WHERE clause of a single statement and filters the student table in the database. This avoids the N+1 pattern that would result from calling the per student evaluator in a loop. An automated test asserts that the two approaches agree.</w:t>
+        <w:t>For a whole cohort against one drive, a separate endpoint pushes the criteria into the WHERE clause of a single statement and filters the student table in the database. This avoids issuing one query per student, which calling the per student evaluator in a loop would require. An automated test asserts that the two approaches agree.</w:t>
       </w:r>
     </w:p>
     <w:p>
@@ -6273,7 +6273,7 @@
         <w:jc w:val="both"/>
       </w:pPr>
       <w:r>
-        <w:t>The rules in section 6.1 could have been written as triggers. They were not, for three reasons. First, the assignment specification does not require them. Second, a trigger raises SIGNAL with a message that is difficult to present usefully to a user, whereas the service layer can return a structured list of reasons. Third, Phase 1 already recorded the limitation that a MySQL trigger validates at write time only, cannot be deferred to the end of a transaction, and cannot retroactively validate rows that already exist; it is therefore not the formal invariant that a FOREIGN KEY is.</w:t>
+        <w:t>The ten rules in section 6.1 could have been written as triggers. They were not, for three reasons. First, the assignment specification does not require them. Second, a trigger raises SIGNAL with a message that is difficult to present usefully to a user, whereas the service layer can return a structured list of reasons. Third, Phase 1 already recorded the limitation that a MySQL trigger validates at write time only, cannot be deferred to the end of a transaction, and cannot retroactively validate rows that already exist; it is therefore not the formal invariant that a FOREIGN KEY is.</w:t>
       </w:r>
     </w:p>
     <w:p>
@@ -6833,7 +6833,7 @@
           <w:i w:val="0"/>
           <w:sz w:val="24"/>
         </w:rPr>
-        <w:t>7.4 Avoiding the N+1 pattern</w:t>
+        <w:t>7.4 Avoiding repeated queries</w:t>
       </w:r>
     </w:p>
     <w:p>
@@ -6841,7 +6841,7 @@
         <w:jc w:val="both"/>
       </w:pPr>
       <w:r>
-        <w:t>Three measures keep query counts bounded. The dashboard issues a small fixed set of aggregate statements rather than one per entity. List endpoints join their related tables within a single statement, so a page of applications arrives with its student, drive and company data already attached. Cohort eligibility is evaluated as one filtered query rather than one query per student.</w:t>
+        <w:t>A common failing in a data driven application is to fetch a list of items and then issue one further query for each item, so that displaying fifty rows costs fifty-one statements. Three measures prevent that here. The dashboard issues a small fixed set of aggregate statements rather than one per entity. List endpoints join their related tables within a single statement, so a page of applications arrives with its student, drive and company data already attached. Cohort eligibility is evaluated as one filtered query rather than one query per student.</w:t>
       </w:r>
     </w:p>
     <w:p>
@@ -8534,7 +8534,7 @@
         <w:jc w:val="both"/>
       </w:pPr>
       <w:r>
-        <w:t>The suite additionally covers the documented policies P1 and P2, the drive status transition policy in both directions, the student skill composite key lifecycle, all thirteen reports, response shape conventions, and the assertion that error responses leak no internal detail.</w:t>
+        <w:t>The suite additionally covers the missing criteria and missing department policies of section 6.3, the drive status transition policy in both directions, the student skill composite key lifecycle, all thirteen reports, response shape conventions, and the assertion that error responses leak no internal detail.</w:t>
       </w:r>
     </w:p>
     <w:p>
@@ -9351,7 +9351,7 @@
               <w:rPr>
                 <w:sz w:val="17"/>
               </w:rPr>
-              <w:t>Yes, Figure 16, 'Showing 1-11 of 11'</w:t>
+              <w:t>Yes, see Figure 16, which reads 'Showing 1-11 of 11'</w:t>
             </w:r>
           </w:p>
         </w:tc>
@@ -9808,7 +9808,7 @@
               <w:rPr>
                 <w:sz w:val="17"/>
               </w:rPr>
-              <w:t>Rules T1 to T8 and T10</w:t>
+              <w:t>Nine of the ten cross-table rules in section 6.1</w:t>
             </w:r>
           </w:p>
         </w:tc>
@@ -9838,7 +9838,7 @@
               <w:rPr>
                 <w:sz w:val="17"/>
               </w:rPr>
-              <w:t>Rule T9</w:t>
+              <w:t>The tenth rule, employee code unique per company</w:t>
             </w:r>
           </w:p>
         </w:tc>
@@ -10635,7 +10635,7 @@
           <w:color w:val="555555"/>
           <w:sz w:val="18"/>
         </w:rPr>
-        <w:t>Figure 7. Drive detail. This drive has no eligibility_criteria row, and policy P1 is stated in plain language rather than shown as an empty section or as zero cut-offs. The eligible departments and required skills are also shown.</w:t>
+        <w:t>Figure 7. Drive detail. This drive has no eligibility_criteria row, and that condition is stated in plain language rather than shown as an empty section or as zero cut-offs. The eligible departments and required skills are also shown.</w:t>
       </w:r>
     </w:p>
     <w:p>
@@ -11220,7 +11220,7 @@
         <w:spacing w:after="60"/>
       </w:pPr>
       <w:r>
-        <w:t>Rule T9 is not implemented. company_employee_code is not checked for uniqueness within a company. The constraint is scoped to a company, which the present schema does not express, and implementing it would have required either a schema change or a cross-table check that no Phase 2 screen currently needs.</w:t>
+        <w:t>One of the ten cross-table rules in section 6.1 is not implemented: company_employee_code is not checked for uniqueness within a company. That uniqueness is scoped to a company, which the present schema does not express, and implementing it would have required either a schema change or a cross-table check that no Phase 2 screen currently needs.</w:t>
       </w:r>
     </w:p>
     <w:p>
@@ -11321,7 +11321,7 @@
         <w:jc w:val="both"/>
       </w:pPr>
       <w:r>
-        <w:t>The rules that Phase 1 could only document are now enforced. Nine of the ten Tier 2 rules are implemented in the service layer, where they apply to every caller rather than only to the browser, and each is covered by an automated test. The five questions Phase 1 left open have been decided explicitly, reported through the API and shown in the interface, rather than resolved silently inside the code.</w:t>
+        <w:t>The rules that Phase 1 could only document are now enforced. Nine of the ten cross-table rules are implemented in the service layer, where they apply to every caller rather than only to the browser, and each is covered by an automated test. The five questions Phase 1 left open have been decided explicitly, reported through the API and shown in the interface, rather than resolved silently inside the code.</w:t>
       </w:r>
     </w:p>
     <w:p>
@@ -11337,7 +11337,7 @@
         <w:jc w:val="both"/>
       </w:pPr>
       <w:r>
-        <w:t>The system is verifiable. Sixty-seven integration tests run against the real database and all pass, each inside a transaction that is rolled back so the demonstration data is never disturbed. Fifty-two endpoints were exercised by hand in addition. Seventeen figures were captured from the running application. Four defects found during verification were corrected, and both the outstanding rule T9 and the absence of browser automation are disclosed rather than concealed.</w:t>
+        <w:t>The system is verifiable. Sixty-seven integration tests run against the real database and all pass, each inside a transaction that is rolled back so the demonstration data is never disturbed. Fifty-two endpoints were exercised by hand in addition. Seventeen figures were captured from the running application. Four defects found during verification were corrected, and both the one outstanding rule and the absence of browser automation are disclosed rather than concealed.</w:t>
       </w:r>
     </w:p>
     <w:p>
@@ -13857,7 +13857,7 @@
           <w:sz w:val="16"/>
           <w:rFonts w:ascii="Consolas" w:hAnsi="Consolas"/>
         </w:rPr>
-        <w:t># T4 / P2 - department restriction.</w:t>
+        <w:t># Department restriction. No rows means every department may apply.</w:t>
         <w:br/>
         <w:t>dept_ids = eligible_department_ids(conn, drive_id)</w:t>
         <w:br/>
@@ -13876,7 +13876,7 @@
         <w:t xml:space="preserve">            "Student's department is not in the drive's eligible department list.")</w:t>
         <w:br/>
         <w:br/>
-        <w:t># T3 / T5 / P1 - academic criteria.</w:t>
+        <w:t># Academic criteria. No row means no academic gate, not zero cut-offs.</w:t>
         <w:br/>
         <w:t>criteria = get_by_pk(conn, "eligibility_criteria", "drive_id", drive_id)</w:t>
         <w:br/>
@@ -13903,7 +13903,7 @@
         <w:br/>
         <w:t>else:</w:t>
         <w:br/>
-        <w:t xml:space="preserve">    # P1 - reported, never silently treated as zero cut-offs.</w:t>
+        <w:t xml:space="preserve">    # Reported as undefined, never silently treated as zero cut-offs.</w:t>
         <w:br/>
         <w:t xml:space="preserve">    checks.append(_check("eligibility_criteria", "optional",</w:t>
         <w:br/>
@@ -13920,7 +13920,7 @@
           <w:i w:val="0"/>
           <w:sz w:val="24"/>
         </w:rPr>
-        <w:t>B.2 Rule T1, from backend/app/rules.py</w:t>
+        <w:t>B.2 The placement rule, from backend/app/rules.py</w:t>
       </w:r>
     </w:p>
     <w:p>
@@ -13946,7 +13946,7 @@
         <w:br/>
         <w:t xml:space="preserve">    offer = require(conn, "offer", "offer_id", offer_id)</w:t>
         <w:br/>
-        <w:t xml:space="preserve">    # T1 - a placement may only be recorded against an accepted offer.</w:t>
+        <w:t xml:space="preserve">    # A placement may only be recorded against an accepted offer.</w:t>
         <w:br/>
         <w:t xml:space="preserve">    if offer["offer_status"] != "Accepted":</w:t>
         <w:br/>

</xml_diff>